<commit_message>
Signal: final reviewer corrections + branded PDF + split teasers
- Apply the reviewer's substantive edits to the weekly Signal: no hard
  economic mechanism, non-conclusive cross-asset read (liquidity vs
  debasement), running-median scoring rule, copper in the calm set,
  S&P 500, metals persistence, naive->naive, footer de-dup.
- Teaser copy: 'direction scorecard', grammatical calm-markets line.
- Split the teaser into a LinkedIn variant (with hashtags) and a
  Substack variant (no hashtags).
- Add signal_pdf.py: renders a Signal md into a branded, logo'd,
  chart-embedded PDF via headless Chrome (local delivery step).

Co-Authored-By: Claude Opus 4.8 <noreply@anthropic.com>
</commit_message>
<xml_diff>
--- a/reports/signals/docx/levanter-signal-2026-08-24-v3.docx
+++ b/reports/signals/docx/levanter-signal-2026-08-24-v3.docx
@@ -41,7 +41,7 @@
         <w:rPr>
           <w:i/>
         </w:rPr>
-        <w:t>Data captured at 19:30 GST on 24 August 2026. Every figure below is stamped to a period. This is the accountable read behind the free weekly: the changes since last week, the levels to watch, and a claim we will score in the next issue.</w:t>
+        <w:t>Data captured at 19:45 GST on 24 August 2026. Every figure below is stamped to a period. This is the accountable read behind the free weekly: the changes since last week, the levels to watch, and a claim we will score in the next issue.</w:t>
       </w:r>
     </w:p>
     <w:p/>
@@ -95,7 +95,7 @@
     </w:p>
     <w:p>
       <w:r>
-        <w:t>The power law is a fit of price to time. It has no economic mechanism behind it, it cannot call tops, and a line that holds in the historical sample can break out of it. It is a valuation anchor, not a timing tool. Treat the fair value and the floor as distant reference points, never as targets and never as a reason to size up.</w:t>
+        <w:t>It is a statistical fit of price to time. It has no hard economic mechanism behind it, cannot call tops, and may fail outside the historical sample. It is a valuation anchor, not a timing tool. Treat the fair value and the floor as distant reference points, never as targets and never as a reason to size up.</w:t>
       </w:r>
     </w:p>
     <w:p>
@@ -108,17 +108,17 @@
     </w:p>
     <w:p>
       <w:r>
-        <w:t>This is the part with measurable skill. The model tags each market turbulent or calm for the week ahead. In the five-year point-in-time backtest it classified the seven-day regime correctly about 66 percent of the time, 11 percentage points above its naive baseline, and 72 percent at thirty days, 16 points above baseline. That is a backtest, not a live forward record: the live scoreboard is only now starting to fill.</w:t>
+        <w:t>This is the part with measurable skill. The model tags each market turbulent or calm for the week ahead. In the five-year point-in-time backtest it classified the seven-day regime correctly about 66 percent of the time, 11 percentage points above its naïve baseline, and 72 percent at thirty days, 16 points above baseline. That is a backtest, not a live forward record: the live scoreboard is only now starting to fill.</w:t>
       </w:r>
     </w:p>
     <w:p>
       <w:r>
-        <w:t>For the coming week the model reads six markets turbulent: bitcoin, ether, gold, silver, platinum and USDCHF. The rest is calm, including six of the seven displayed FX pairs, the S&amp;P, and oil, copper and natural gas in energy. So the average market is contained while the turbulence is concentrated, which settles the apparent tension in the free weekly between a mostly-calm board and loud pockets.</w:t>
+        <w:t>For the coming week the model reads six markets turbulent: bitcoin, ether, gold, silver, platinum and USDCHF. The rest of the displayed set is calm, including solana, six of the seven FX pairs, the S&amp;P 500, oil, copper and natural gas. The average market is therefore contained even though a few names are carrying wide ranges.</w:t>
       </w:r>
     </w:p>
     <w:p>
       <w:r>
-        <w:t>The loudest reads are in big crypto. Bitcoin's one-week volatility is near 54 percent against a 39 median, and ether near 101 against 53, close to double its normal. Both are turbulent at seven days while their thirty-day classifications remain calm. The disagreement between the horizons identifies a near-term disturbance. It does not yet establish whether that disturbance will persist. The metals read turbulent on both the one-week and one-month horizons, so their wider ranges are more persistent.</w:t>
+        <w:t>The loudest reads are in big crypto. Bitcoin's one-week volatility is near 54 percent against a 39 median, and ether near 101 against 53, close to double its normal. Both are turbulent at seven days while their thirty-day classifications remain calm. The two horizons disagree, which flags a near-term disturbance without telling us whether it will last. The metals read turbulent at both seven and thirty days, indicating that their elevated-volatility classification extends beyond the coming week.</w:t>
       </w:r>
     </w:p>
     <w:p>
@@ -154,7 +154,7 @@
     </w:p>
     <w:p>
       <w:r>
-        <w:t>Read across the three markets, the shape is concentration, not breadth: the range sits in the metals and the largest coins while the dollar stays quiet. A safety bid in metals beside a speculative bid in crypto reads as hedging, not conviction.</w:t>
+        <w:t>Read across the three asset classes, the unusual combination is strength in both precious metals and speculative crypto while the dollar remains comparatively quiet. That is consistent with abundant liquidity or a debasement trade, but the tape alone cannot tell us which explanation is driving it.</w:t>
       </w:r>
     </w:p>
     <w:p>
@@ -223,13 +223,13 @@
     </w:p>
     <w:p>
       <w:r>
-        <w:t>To score next week: the model calls bitcoin, ether, gold, silver, platinum and USDCHF turbulent and the rest calm. In the next issue we mark whether those turbulent markets realised a wider-than-median weekly range and whether the calm ones stayed contained. That is the claim you can hold this Signal to.</w:t>
+        <w:t>To score next week: the model calls bitcoin, ether, gold, silver, platinum and USDCHF turbulent and the rest calm. In the next issue we score each call the way the model does, whether realised volatility over the week came in above or below the asset's running-median volatility, and show the hits and misses. That is the claim you can hold this Signal to.</w:t>
       </w:r>
     </w:p>
     <w:p/>
     <w:p>
       <w:r>
-        <w:t xml:space="preserve">*This is the Levanter Signal, our new weekly newsletter, free this week and next. After that it moves to subscribers, so subscribe now at </w:t>
+        <w:t xml:space="preserve">*This is the Levanter Signal, our new weekly newsletter. Subscribe at </w:t>
       </w:r>
       <w:hyperlink r:id="rId9">
         <w:r>
@@ -241,7 +241,7 @@
         </w:r>
       </w:hyperlink>
       <w:r>
-        <w:t xml:space="preserve"> to keep getting it. The daily, weekly and monthly reviews stay free at </w:t>
+        <w:t xml:space="preserve"> to keep receiving it once the free launch ends. The daily, weekly and monthly reviews stay free at </w:t>
       </w:r>
       <w:hyperlink r:id="rId10">
         <w:r>

</xml_diff>